<commit_message>
determine values for dashboard
</commit_message>
<xml_diff>
--- a/Data Analysis & AI/tests/Data/Tests.docx
+++ b/Data Analysis & AI/tests/Data/Tests.docx
@@ -506,16 +506,62 @@
         </w:rPr>
         <w:t xml:space="preserve"> </w:t>
       </w:r>
-      <w:r>
-        <w:rPr>
-          <w:b/>
-          <w:bCs/>
-          <w:sz w:val="40"/>
-          <w:szCs w:val="40"/>
-          <w:lang w:bidi="ar-EG"/>
-        </w:rPr>
-        <w:t>ABO_Group , RH_Factor</w:t>
-      </w:r>
+      <w:proofErr w:type="spellStart"/>
+      <w:r>
+        <w:rPr>
+          <w:b/>
+          <w:bCs/>
+          <w:sz w:val="40"/>
+          <w:szCs w:val="40"/>
+          <w:lang w:bidi="ar-EG"/>
+        </w:rPr>
+        <w:t>ABO_</w:t>
+      </w:r>
+      <w:proofErr w:type="gramStart"/>
+      <w:r>
+        <w:rPr>
+          <w:b/>
+          <w:bCs/>
+          <w:sz w:val="40"/>
+          <w:szCs w:val="40"/>
+          <w:lang w:bidi="ar-EG"/>
+        </w:rPr>
+        <w:t>Group</w:t>
+      </w:r>
+      <w:proofErr w:type="spellEnd"/>
+      <w:r>
+        <w:rPr>
+          <w:b/>
+          <w:bCs/>
+          <w:sz w:val="40"/>
+          <w:szCs w:val="40"/>
+          <w:lang w:bidi="ar-EG"/>
+        </w:rPr>
+        <w:t xml:space="preserve"> ,</w:t>
+      </w:r>
+      <w:proofErr w:type="gramEnd"/>
+      <w:r>
+        <w:rPr>
+          <w:b/>
+          <w:bCs/>
+          <w:sz w:val="40"/>
+          <w:szCs w:val="40"/>
+          <w:lang w:bidi="ar-EG"/>
+        </w:rPr>
+        <w:t xml:space="preserve"> </w:t>
+      </w:r>
+      <w:proofErr w:type="spellStart"/>
+      <w:r>
+        <w:rPr>
+          <w:b/>
+          <w:bCs/>
+          <w:sz w:val="40"/>
+          <w:szCs w:val="40"/>
+          <w:lang w:bidi="ar-EG"/>
+        </w:rPr>
+        <w:t>RH_Factor</w:t>
+      </w:r>
+      <w:proofErr w:type="spellEnd"/>
     </w:p>
     <w:p>
       <w:pPr>
@@ -540,8 +586,22 @@
           <w:szCs w:val="40"/>
           <w:lang w:bidi="ar-EG"/>
         </w:rPr>
-        <w:t>Type: String,String</w:t>
-      </w:r>
+        <w:t xml:space="preserve">Type: </w:t>
+      </w:r>
+      <w:proofErr w:type="spellStart"/>
+      <w:proofErr w:type="gramStart"/>
+      <w:r>
+        <w:rPr>
+          <w:b/>
+          <w:bCs/>
+          <w:sz w:val="40"/>
+          <w:szCs w:val="40"/>
+          <w:lang w:bidi="ar-EG"/>
+        </w:rPr>
+        <w:t>String,String</w:t>
+      </w:r>
+      <w:proofErr w:type="spellEnd"/>
+      <w:proofErr w:type="gramEnd"/>
     </w:p>
     <w:p>
       <w:pPr>
@@ -820,17 +880,18 @@
           <w:szCs w:val="32"/>
           <w:lang w:bidi="ar-EG"/>
         </w:rPr>
-        <w:t xml:space="preserve">    Variables: HB, RBC</w:t>
-      </w:r>
-      <w:r>
-        <w:rPr>
-          <w:b/>
-          <w:bCs/>
+        <w:t xml:space="preserve">    Variables: </w:t>
+      </w:r>
+      <w:r>
+        <w:rPr>
+          <w:b/>
+          <w:bCs/>
+          <w:color w:val="EE0000"/>
           <w:sz w:val="32"/>
           <w:szCs w:val="32"/>
           <w:lang w:bidi="ar-EG"/>
         </w:rPr>
-        <w:t>s</w:t>
+        <w:t>HB</w:t>
       </w:r>
       <w:r>
         <w:rPr>
@@ -840,8 +901,9 @@
           <w:szCs w:val="32"/>
           <w:lang w:bidi="ar-EG"/>
         </w:rPr>
-        <w:t>_Count, M</w:t>
-      </w:r>
+        <w:t xml:space="preserve">, </w:t>
+      </w:r>
+      <w:proofErr w:type="spellStart"/>
       <w:r>
         <w:rPr>
           <w:b/>
@@ -850,7 +912,7 @@
           <w:szCs w:val="32"/>
           <w:lang w:bidi="ar-EG"/>
         </w:rPr>
-        <w:t>CV</w:t>
+        <w:t>RBC</w:t>
       </w:r>
       <w:r>
         <w:rPr>
@@ -860,8 +922,82 @@
           <w:szCs w:val="32"/>
           <w:lang w:bidi="ar-EG"/>
         </w:rPr>
-        <w:t>, MCH, MCHC, WBC, lymphocytes, platelet_count</w:t>
-      </w:r>
+        <w:t>s</w:t>
+      </w:r>
+      <w:r>
+        <w:rPr>
+          <w:b/>
+          <w:bCs/>
+          <w:sz w:val="32"/>
+          <w:szCs w:val="32"/>
+          <w:lang w:bidi="ar-EG"/>
+        </w:rPr>
+        <w:t>_Count</w:t>
+      </w:r>
+      <w:proofErr w:type="spellEnd"/>
+      <w:r>
+        <w:rPr>
+          <w:b/>
+          <w:bCs/>
+          <w:sz w:val="32"/>
+          <w:szCs w:val="32"/>
+          <w:lang w:bidi="ar-EG"/>
+        </w:rPr>
+        <w:t>, M</w:t>
+      </w:r>
+      <w:r>
+        <w:rPr>
+          <w:b/>
+          <w:bCs/>
+          <w:sz w:val="32"/>
+          <w:szCs w:val="32"/>
+          <w:lang w:bidi="ar-EG"/>
+        </w:rPr>
+        <w:t>CV</w:t>
+      </w:r>
+      <w:r>
+        <w:rPr>
+          <w:b/>
+          <w:bCs/>
+          <w:sz w:val="32"/>
+          <w:szCs w:val="32"/>
+          <w:lang w:bidi="ar-EG"/>
+        </w:rPr>
+        <w:t xml:space="preserve">, MCH, MCHC, </w:t>
+      </w:r>
+      <w:r>
+        <w:rPr>
+          <w:b/>
+          <w:bCs/>
+          <w:color w:val="EE0000"/>
+          <w:sz w:val="32"/>
+          <w:szCs w:val="32"/>
+          <w:lang w:bidi="ar-EG"/>
+        </w:rPr>
+        <w:t>WBC</w:t>
+      </w:r>
+      <w:r>
+        <w:rPr>
+          <w:b/>
+          <w:bCs/>
+          <w:sz w:val="32"/>
+          <w:szCs w:val="32"/>
+          <w:lang w:bidi="ar-EG"/>
+        </w:rPr>
+        <w:t xml:space="preserve">, lymphocytes, </w:t>
+      </w:r>
+      <w:proofErr w:type="spellStart"/>
+      <w:r>
+        <w:rPr>
+          <w:b/>
+          <w:bCs/>
+          <w:sz w:val="32"/>
+          <w:szCs w:val="32"/>
+          <w:lang w:bidi="ar-EG"/>
+        </w:rPr>
+        <w:t>platelet_count</w:t>
+      </w:r>
+      <w:proofErr w:type="spellEnd"/>
     </w:p>
     <w:p>
       <w:pPr>
@@ -1188,7 +1324,28 @@
           <w:szCs w:val="40"/>
           <w:lang w:bidi="ar-EG"/>
         </w:rPr>
-        <w:t>Variables: HbA1c:</w:t>
+        <w:t xml:space="preserve">Variables: </w:t>
+      </w:r>
+      <w:r>
+        <w:rPr>
+          <w:b/>
+          <w:bCs/>
+          <w:color w:val="EE0000"/>
+          <w:sz w:val="40"/>
+          <w:szCs w:val="40"/>
+          <w:lang w:bidi="ar-EG"/>
+        </w:rPr>
+        <w:t>HbA1c</w:t>
+      </w:r>
+      <w:r>
+        <w:rPr>
+          <w:b/>
+          <w:bCs/>
+          <w:sz w:val="40"/>
+          <w:szCs w:val="40"/>
+          <w:lang w:bidi="ar-EG"/>
+        </w:rPr>
+        <w:t>:</w:t>
       </w:r>
     </w:p>
     <w:p>
@@ -1613,15 +1770,27 @@
         </w:rPr>
         <w:t xml:space="preserve">, </w:t>
       </w:r>
-      <w:r>
-        <w:rPr>
-          <w:b/>
-          <w:bCs/>
-          <w:sz w:val="36"/>
-          <w:szCs w:val="36"/>
-          <w:lang w:bidi="ar-EG"/>
-        </w:rPr>
-        <w:t>Specific_Gravity,</w:t>
+      <w:proofErr w:type="spellStart"/>
+      <w:r>
+        <w:rPr>
+          <w:b/>
+          <w:bCs/>
+          <w:sz w:val="36"/>
+          <w:szCs w:val="36"/>
+          <w:lang w:bidi="ar-EG"/>
+        </w:rPr>
+        <w:t>Specific_Gravity</w:t>
+      </w:r>
+      <w:proofErr w:type="spellEnd"/>
+      <w:r>
+        <w:rPr>
+          <w:b/>
+          <w:bCs/>
+          <w:sz w:val="36"/>
+          <w:szCs w:val="36"/>
+          <w:lang w:bidi="ar-EG"/>
+        </w:rPr>
+        <w:t>,</w:t>
       </w:r>
       <w:r>
         <w:rPr>
@@ -1637,11 +1806,22 @@
         <w:rPr>
           <w:b/>
           <w:bCs/>
-          <w:sz w:val="36"/>
-          <w:szCs w:val="36"/>
-          <w:lang w:bidi="ar-EG"/>
-        </w:rPr>
-        <w:t xml:space="preserve">Protein, Glucose, Nitrite, Ketones, </w:t>
+          <w:color w:val="EE0000"/>
+          <w:sz w:val="36"/>
+          <w:szCs w:val="36"/>
+          <w:lang w:bidi="ar-EG"/>
+        </w:rPr>
+        <w:t>Protein, Glucose</w:t>
+      </w:r>
+      <w:r>
+        <w:rPr>
+          <w:b/>
+          <w:bCs/>
+          <w:sz w:val="36"/>
+          <w:szCs w:val="36"/>
+          <w:lang w:bidi="ar-EG"/>
+        </w:rPr>
+        <w:t xml:space="preserve">, Nitrite, Ketones, </w:t>
       </w:r>
       <w:r>
         <w:rPr>
@@ -1661,6 +1841,91 @@
           <w:szCs w:val="36"/>
           <w:lang w:bidi="ar-EG"/>
         </w:rPr>
+        <w:t xml:space="preserve"> RBCs, </w:t>
+      </w:r>
+      <w:r>
+        <w:rPr>
+          <w:b/>
+          <w:bCs/>
+          <w:sz w:val="36"/>
+          <w:szCs w:val="36"/>
+          <w:lang w:bidi="ar-EG"/>
+        </w:rPr>
+        <w:t>Leukocytes</w:t>
+      </w:r>
+    </w:p>
+    <w:p>
+      <w:pPr>
+        <w:rPr>
+          <w:b/>
+          <w:bCs/>
+          <w:sz w:val="36"/>
+          <w:szCs w:val="36"/>
+          <w:lang w:bidi="ar-EG"/>
+        </w:rPr>
+      </w:pPr>
+      <w:r>
+        <w:rPr>
+          <w:b/>
+          <w:bCs/>
+          <w:sz w:val="36"/>
+          <w:szCs w:val="36"/>
+          <w:lang w:bidi="ar-EG"/>
+        </w:rPr>
+        <w:t xml:space="preserve">Types: </w:t>
+      </w:r>
+      <w:proofErr w:type="gramStart"/>
+      <w:r>
+        <w:rPr>
+          <w:b/>
+          <w:bCs/>
+          <w:sz w:val="36"/>
+          <w:szCs w:val="36"/>
+          <w:lang w:bidi="ar-EG"/>
+        </w:rPr>
+        <w:t xml:space="preserve">all </w:t>
+      </w:r>
+      <w:r>
+        <w:rPr>
+          <w:b/>
+          <w:bCs/>
+          <w:sz w:val="36"/>
+          <w:szCs w:val="36"/>
+          <w:lang w:bidi="ar-EG"/>
+        </w:rPr>
+        <w:t>:</w:t>
+      </w:r>
+      <w:proofErr w:type="gramEnd"/>
+      <w:r>
+        <w:rPr>
+          <w:b/>
+          <w:bCs/>
+          <w:sz w:val="36"/>
+          <w:szCs w:val="36"/>
+          <w:lang w:bidi="ar-EG"/>
+        </w:rPr>
+        <w:t xml:space="preserve"> string</w:t>
+      </w:r>
+      <w:r>
+        <w:rPr>
+          <w:b/>
+          <w:bCs/>
+          <w:sz w:val="36"/>
+          <w:szCs w:val="36"/>
+          <w:lang w:bidi="ar-EG"/>
+        </w:rPr>
+        <w:t xml:space="preserve">  </w:t>
+      </w:r>
+      <w:r>
+        <w:rPr>
+          <w:rFonts w:hint="cs"/>
+          <w:b/>
+          <w:bCs/>
+          <w:sz w:val="36"/>
+          <w:szCs w:val="36"/>
+          <w:rtl/>
+          <w:lang w:bidi="ar-EG"/>
+        </w:rPr>
         <w:t xml:space="preserve"> </w:t>
       </w:r>
       <w:r>
@@ -1671,142 +1936,95 @@
           <w:szCs w:val="36"/>
           <w:lang w:bidi="ar-EG"/>
         </w:rPr>
-        <w:t>RBCs</w:t>
-      </w:r>
-      <w:r>
-        <w:rPr>
-          <w:b/>
-          <w:bCs/>
-          <w:sz w:val="36"/>
-          <w:szCs w:val="36"/>
-          <w:lang w:bidi="ar-EG"/>
-        </w:rPr>
-        <w:t xml:space="preserve">, </w:t>
-      </w:r>
-      <w:r>
-        <w:rPr>
-          <w:b/>
-          <w:bCs/>
-          <w:sz w:val="36"/>
-          <w:szCs w:val="36"/>
-          <w:lang w:bidi="ar-EG"/>
-        </w:rPr>
-        <w:t>Leukocytes</w:t>
-      </w:r>
-    </w:p>
-    <w:p>
-      <w:pPr>
-        <w:rPr>
-          <w:b/>
-          <w:bCs/>
-          <w:sz w:val="36"/>
-          <w:szCs w:val="36"/>
-          <w:lang w:bidi="ar-EG"/>
-        </w:rPr>
-      </w:pPr>
-      <w:r>
-        <w:rPr>
-          <w:b/>
-          <w:bCs/>
-          <w:sz w:val="36"/>
-          <w:szCs w:val="36"/>
-          <w:lang w:bidi="ar-EG"/>
-        </w:rPr>
-        <w:t xml:space="preserve">Types: </w:t>
-      </w:r>
-      <w:r>
-        <w:rPr>
-          <w:b/>
-          <w:bCs/>
-          <w:sz w:val="36"/>
-          <w:szCs w:val="36"/>
-          <w:lang w:bidi="ar-EG"/>
-        </w:rPr>
-        <w:t xml:space="preserve">all </w:t>
-      </w:r>
-      <w:r>
-        <w:rPr>
-          <w:b/>
-          <w:bCs/>
-          <w:sz w:val="36"/>
-          <w:szCs w:val="36"/>
-          <w:lang w:bidi="ar-EG"/>
-        </w:rPr>
-        <w:t>: string</w:t>
-      </w:r>
-      <w:r>
-        <w:rPr>
-          <w:b/>
-          <w:bCs/>
-          <w:sz w:val="36"/>
-          <w:szCs w:val="36"/>
+        <w:t>except</w:t>
+      </w:r>
+      <w:r>
+        <w:rPr>
+          <w:rFonts w:hint="cs"/>
+          <w:b/>
+          <w:bCs/>
+          <w:sz w:val="36"/>
+          <w:szCs w:val="36"/>
+          <w:rtl/>
+          <w:lang w:bidi="ar-EG"/>
+        </w:rPr>
+        <w:t xml:space="preserve"> </w:t>
+      </w:r>
+      <w:proofErr w:type="gramStart"/>
+      <w:r>
+        <w:rPr>
+          <w:rFonts w:hint="cs"/>
+          <w:b/>
+          <w:bCs/>
+          <w:sz w:val="36"/>
+          <w:szCs w:val="36"/>
+          <w:rtl/>
           <w:lang w:bidi="ar-EG"/>
         </w:rPr>
         <w:t xml:space="preserve">  </w:t>
       </w:r>
       <w:r>
         <w:rPr>
-          <w:rFonts w:hint="cs"/>
-          <w:b/>
-          <w:bCs/>
-          <w:sz w:val="36"/>
-          <w:szCs w:val="36"/>
-          <w:rtl/>
+          <w:b/>
+          <w:bCs/>
+          <w:sz w:val="36"/>
+          <w:szCs w:val="36"/>
+          <w:lang w:bidi="ar-EG"/>
+        </w:rPr>
+        <w:t>,</w:t>
+      </w:r>
+      <w:proofErr w:type="gramEnd"/>
+      <w:r>
+        <w:rPr>
+          <w:b/>
+          <w:bCs/>
+          <w:sz w:val="36"/>
+          <w:szCs w:val="36"/>
+          <w:lang w:bidi="ar-EG"/>
+        </w:rPr>
+        <w:t xml:space="preserve"> PH </w:t>
+      </w:r>
+      <w:r>
+        <w:rPr>
+          <w:b/>
+          <w:bCs/>
+          <w:sz w:val="36"/>
+          <w:szCs w:val="36"/>
+          <w:lang w:bidi="ar-EG"/>
+        </w:rPr>
+        <w:t>/Specific gravity</w:t>
+      </w:r>
+      <w:r>
+        <w:rPr>
+          <w:b/>
+          <w:bCs/>
+          <w:sz w:val="36"/>
+          <w:szCs w:val="36"/>
+          <w:lang w:bidi="ar-EG"/>
+        </w:rPr>
+        <w:t xml:space="preserve">: </w:t>
+      </w:r>
+      <w:proofErr w:type="gramStart"/>
+      <w:r>
+        <w:rPr>
+          <w:b/>
+          <w:bCs/>
+          <w:sz w:val="36"/>
+          <w:szCs w:val="36"/>
+          <w:lang w:bidi="ar-EG"/>
+        </w:rPr>
+        <w:t>float ,</w:t>
+      </w:r>
+      <w:proofErr w:type="gramEnd"/>
+      <w:r>
+        <w:rPr>
+          <w:b/>
+          <w:bCs/>
+          <w:sz w:val="36"/>
+          <w:szCs w:val="36"/>
           <w:lang w:bidi="ar-EG"/>
         </w:rPr>
         <w:t xml:space="preserve"> </w:t>
-      </w:r>
-      <w:r>
-        <w:rPr>
-          <w:b/>
-          <w:bCs/>
-          <w:sz w:val="36"/>
-          <w:szCs w:val="36"/>
-          <w:lang w:bidi="ar-EG"/>
-        </w:rPr>
-        <w:t>except</w:t>
-      </w:r>
-      <w:r>
-        <w:rPr>
-          <w:rFonts w:hint="cs"/>
-          <w:b/>
-          <w:bCs/>
-          <w:sz w:val="36"/>
-          <w:szCs w:val="36"/>
-          <w:rtl/>
-          <w:lang w:bidi="ar-EG"/>
-        </w:rPr>
-        <w:t xml:space="preserve">   </w:t>
-      </w:r>
-      <w:r>
-        <w:rPr>
-          <w:b/>
-          <w:bCs/>
-          <w:sz w:val="36"/>
-          <w:szCs w:val="36"/>
-          <w:lang w:bidi="ar-EG"/>
-        </w:rPr>
-        <w:t xml:space="preserve">, PH </w:t>
-      </w:r>
-      <w:r>
-        <w:rPr>
-          <w:b/>
-          <w:bCs/>
-          <w:sz w:val="36"/>
-          <w:szCs w:val="36"/>
-          <w:lang w:bidi="ar-EG"/>
-        </w:rPr>
-        <w:t>/Specific gravity</w:t>
-      </w:r>
-      <w:r>
-        <w:rPr>
-          <w:b/>
-          <w:bCs/>
-          <w:sz w:val="36"/>
-          <w:szCs w:val="36"/>
-          <w:lang w:bidi="ar-EG"/>
-        </w:rPr>
-        <w:t xml:space="preserve">: float , </w:t>
       </w:r>
     </w:p>
     <w:p>
@@ -1903,7 +2121,95 @@
           <w:szCs w:val="40"/>
           <w:lang w:bidi="ar-EG"/>
         </w:rPr>
-        <w:t>IN UI: Protein(Albumin) , Glucose(Sugar),Ketones(</w:t>
+        <w:t xml:space="preserve">IN UI: </w:t>
+      </w:r>
+      <w:proofErr w:type="gramStart"/>
+      <w:r>
+        <w:rPr>
+          <w:b/>
+          <w:bCs/>
+          <w:sz w:val="40"/>
+          <w:szCs w:val="40"/>
+          <w:lang w:bidi="ar-EG"/>
+        </w:rPr>
+        <w:t>Protein(</w:t>
+      </w:r>
+      <w:proofErr w:type="gramEnd"/>
+      <w:r>
+        <w:rPr>
+          <w:b/>
+          <w:bCs/>
+          <w:sz w:val="40"/>
+          <w:szCs w:val="40"/>
+          <w:lang w:bidi="ar-EG"/>
+        </w:rPr>
+        <w:t>Albumin</w:t>
+      </w:r>
+      <w:proofErr w:type="gramStart"/>
+      <w:r>
+        <w:rPr>
+          <w:b/>
+          <w:bCs/>
+          <w:sz w:val="40"/>
+          <w:szCs w:val="40"/>
+          <w:lang w:bidi="ar-EG"/>
+        </w:rPr>
+        <w:t>) ,</w:t>
+      </w:r>
+      <w:proofErr w:type="gramEnd"/>
+      <w:r>
+        <w:rPr>
+          <w:b/>
+          <w:bCs/>
+          <w:sz w:val="40"/>
+          <w:szCs w:val="40"/>
+          <w:lang w:bidi="ar-EG"/>
+        </w:rPr>
+        <w:t xml:space="preserve"> </w:t>
+      </w:r>
+      <w:proofErr w:type="gramStart"/>
+      <w:r>
+        <w:rPr>
+          <w:b/>
+          <w:bCs/>
+          <w:sz w:val="40"/>
+          <w:szCs w:val="40"/>
+          <w:lang w:bidi="ar-EG"/>
+        </w:rPr>
+        <w:t>Glucose(</w:t>
+      </w:r>
+      <w:proofErr w:type="gramEnd"/>
+      <w:r>
+        <w:rPr>
+          <w:b/>
+          <w:bCs/>
+          <w:sz w:val="40"/>
+          <w:szCs w:val="40"/>
+          <w:lang w:bidi="ar-EG"/>
+        </w:rPr>
+        <w:t>Sugar</w:t>
+      </w:r>
+      <w:proofErr w:type="gramStart"/>
+      <w:r>
+        <w:rPr>
+          <w:b/>
+          <w:bCs/>
+          <w:sz w:val="40"/>
+          <w:szCs w:val="40"/>
+          <w:lang w:bidi="ar-EG"/>
+        </w:rPr>
+        <w:t>),Ketones</w:t>
+      </w:r>
+      <w:proofErr w:type="gramEnd"/>
+      <w:r>
+        <w:rPr>
+          <w:b/>
+          <w:bCs/>
+          <w:sz w:val="40"/>
+          <w:szCs w:val="40"/>
+          <w:lang w:bidi="ar-EG"/>
+        </w:rPr>
+        <w:t>(</w:t>
       </w:r>
       <w:r>
         <w:rPr>
@@ -1944,7 +2250,51 @@
           <w:szCs w:val="40"/>
           <w:lang w:bidi="ar-EG"/>
         </w:rPr>
-        <w:t xml:space="preserve">           Leukocytes(Pus Cells),RBCs (Red Blood Cells)</w:t>
+        <w:t xml:space="preserve">           </w:t>
+      </w:r>
+      <w:proofErr w:type="gramStart"/>
+      <w:r>
+        <w:rPr>
+          <w:b/>
+          <w:bCs/>
+          <w:sz w:val="40"/>
+          <w:szCs w:val="40"/>
+          <w:lang w:bidi="ar-EG"/>
+        </w:rPr>
+        <w:t>Leukocytes(</w:t>
+      </w:r>
+      <w:proofErr w:type="gramEnd"/>
+      <w:r>
+        <w:rPr>
+          <w:b/>
+          <w:bCs/>
+          <w:sz w:val="40"/>
+          <w:szCs w:val="40"/>
+          <w:lang w:bidi="ar-EG"/>
+        </w:rPr>
+        <w:t>Pus Cells</w:t>
+      </w:r>
+      <w:proofErr w:type="gramStart"/>
+      <w:r>
+        <w:rPr>
+          <w:b/>
+          <w:bCs/>
+          <w:sz w:val="40"/>
+          <w:szCs w:val="40"/>
+          <w:lang w:bidi="ar-EG"/>
+        </w:rPr>
+        <w:t>),RBCs</w:t>
+      </w:r>
+      <w:proofErr w:type="gramEnd"/>
+      <w:r>
+        <w:rPr>
+          <w:b/>
+          <w:bCs/>
+          <w:sz w:val="40"/>
+          <w:szCs w:val="40"/>
+          <w:lang w:bidi="ar-EG"/>
+        </w:rPr>
+        <w:t xml:space="preserve"> (Red Blood Cells)</w:t>
       </w:r>
     </w:p>
     <w:p>
@@ -2104,15 +2454,27 @@
           <w:lang w:bidi="ar-EG"/>
         </w:rPr>
       </w:pPr>
-      <w:r>
-        <w:rPr>
-          <w:b/>
-          <w:bCs/>
-          <w:sz w:val="36"/>
-          <w:szCs w:val="36"/>
-          <w:lang w:bidi="ar-EG"/>
-        </w:rPr>
-        <w:t>Type : String</w:t>
+      <w:proofErr w:type="gramStart"/>
+      <w:r>
+        <w:rPr>
+          <w:b/>
+          <w:bCs/>
+          <w:sz w:val="36"/>
+          <w:szCs w:val="36"/>
+          <w:lang w:bidi="ar-EG"/>
+        </w:rPr>
+        <w:t>Type :</w:t>
+      </w:r>
+      <w:proofErr w:type="gramEnd"/>
+      <w:r>
+        <w:rPr>
+          <w:b/>
+          <w:bCs/>
+          <w:sz w:val="36"/>
+          <w:szCs w:val="36"/>
+          <w:lang w:bidi="ar-EG"/>
+        </w:rPr>
+        <w:t xml:space="preserve"> String</w:t>
       </w:r>
     </w:p>
     <w:p>
@@ -2599,17 +2961,20 @@
           <w:szCs w:val="32"/>
           <w:lang w:bidi="ar-EG"/>
         </w:rPr>
-        <w:t>Variables: TSH</w:t>
-      </w:r>
-      <w:r>
-        <w:rPr>
-          <w:b/>
-          <w:bCs/>
+        <w:t xml:space="preserve">Variables: </w:t>
+      </w:r>
+      <w:proofErr w:type="spellStart"/>
+      <w:proofErr w:type="gramStart"/>
+      <w:r>
+        <w:rPr>
+          <w:b/>
+          <w:bCs/>
+          <w:color w:val="EE0000"/>
           <w:sz w:val="32"/>
           <w:szCs w:val="32"/>
           <w:lang w:bidi="ar-EG"/>
         </w:rPr>
-        <w:t>,</w:t>
+        <w:t>TSH</w:t>
       </w:r>
       <w:r>
         <w:rPr>
@@ -2619,8 +2984,30 @@
           <w:szCs w:val="32"/>
           <w:lang w:bidi="ar-EG"/>
         </w:rPr>
-        <w:t>TSH_Unit</w:t>
-      </w:r>
+        <w:t>,</w:t>
+      </w:r>
+      <w:r>
+        <w:rPr>
+          <w:b/>
+          <w:bCs/>
+          <w:sz w:val="32"/>
+          <w:szCs w:val="32"/>
+          <w:lang w:bidi="ar-EG"/>
+        </w:rPr>
+        <w:t>TSH</w:t>
+      </w:r>
+      <w:proofErr w:type="gramEnd"/>
+      <w:r>
+        <w:rPr>
+          <w:b/>
+          <w:bCs/>
+          <w:sz w:val="32"/>
+          <w:szCs w:val="32"/>
+          <w:lang w:bidi="ar-EG"/>
+        </w:rPr>
+        <w:t>_Unit</w:t>
+      </w:r>
+      <w:proofErr w:type="spellEnd"/>
     </w:p>
     <w:p>
       <w:pPr>
@@ -2641,8 +3028,10 @@
           <w:szCs w:val="32"/>
           <w:lang w:bidi="ar-EG"/>
         </w:rPr>
-        <w:t xml:space="preserve">   Type: Float</w:t>
-      </w:r>
+        <w:t xml:space="preserve">   Type: </w:t>
+      </w:r>
+      <w:proofErr w:type="spellStart"/>
+      <w:proofErr w:type="gramStart"/>
       <w:r>
         <w:rPr>
           <w:b/>
@@ -2651,8 +3040,20 @@
           <w:szCs w:val="32"/>
           <w:lang w:bidi="ar-EG"/>
         </w:rPr>
+        <w:t>Float</w:t>
+      </w:r>
+      <w:r>
+        <w:rPr>
+          <w:b/>
+          <w:bCs/>
+          <w:sz w:val="32"/>
+          <w:szCs w:val="32"/>
+          <w:lang w:bidi="ar-EG"/>
+        </w:rPr>
         <w:t>,string</w:t>
       </w:r>
+      <w:proofErr w:type="spellEnd"/>
+      <w:proofErr w:type="gramEnd"/>
     </w:p>
     <w:p>
       <w:pPr>
@@ -2888,8 +3289,21 @@
           <w:szCs w:val="28"/>
           <w:lang w:bidi="ar-EG"/>
         </w:rPr>
-        <w:t>Variables: Ferritin_value</w:t>
-      </w:r>
+        <w:t xml:space="preserve">Variables: </w:t>
+      </w:r>
+      <w:proofErr w:type="spellStart"/>
+      <w:r>
+        <w:rPr>
+          <w:b/>
+          <w:bCs/>
+          <w:color w:val="EE0000"/>
+          <w:sz w:val="28"/>
+          <w:szCs w:val="28"/>
+          <w:lang w:bidi="ar-EG"/>
+        </w:rPr>
+        <w:t>Ferritin_value</w:t>
+      </w:r>
+      <w:proofErr w:type="spellEnd"/>
     </w:p>
     <w:p>
       <w:pPr>
@@ -3137,27 +3551,7 @@
           <w:szCs w:val="44"/>
           <w:lang w:bidi="ar-EG"/>
         </w:rPr>
-        <w:t xml:space="preserve">    String Data -&gt; “</w:t>
-      </w:r>
-      <w:r>
-        <w:rPr>
-          <w:b/>
-          <w:bCs/>
-          <w:sz w:val="44"/>
-          <w:szCs w:val="44"/>
-          <w:lang w:bidi="ar-EG"/>
-        </w:rPr>
-        <w:t>Not Extracted</w:t>
-      </w:r>
-      <w:r>
-        <w:rPr>
-          <w:b/>
-          <w:bCs/>
-          <w:sz w:val="44"/>
-          <w:szCs w:val="44"/>
-          <w:lang w:bidi="ar-EG"/>
-        </w:rPr>
-        <w:t>”</w:t>
+        <w:t xml:space="preserve">    String Data -&gt; “Not Extracted”</w:t>
       </w:r>
     </w:p>
     <w:sectPr>
@@ -4216,6 +4610,7 @@
   <w:style w:type="character" w:default="1" w:styleId="DefaultParagraphFont">
     <w:name w:val="Default Paragraph Font"/>
     <w:uiPriority w:val="1"/>
+    <w:semiHidden/>
     <w:unhideWhenUsed/>
   </w:style>
   <w:style w:type="table" w:default="1" w:styleId="TableNormal">

</xml_diff>